<commit_message>
idk im just trying to setup ssh now rather than https
</commit_message>
<xml_diff>
--- a/Assignment1_CSCU9B3-4.docx
+++ b/Assignment1_CSCU9B3-4.docx
@@ -292,14 +292,14 @@
         <w:tblLook w:val="04a0" w:noHBand="0" w:noVBand="1" w:firstColumn="1" w:lastRow="0" w:lastColumn="0" w:firstRow="1"/>
       </w:tblPr>
       <w:tblGrid>
-        <w:gridCol w:w="2282"/>
-        <w:gridCol w:w="6733"/>
+        <w:gridCol w:w="2281"/>
+        <w:gridCol w:w="6734"/>
       </w:tblGrid>
       <w:tr>
         <w:trPr/>
         <w:tc>
           <w:tcPr>
-            <w:tcW w:w="2282" w:type="dxa"/>
+            <w:tcW w:w="2281" w:type="dxa"/>
             <w:tcBorders/>
             <w:shd w:color="auto" w:fill="FFFFFF" w:themeFill="background1" w:val="clear"/>
           </w:tcPr>
@@ -307,6 +307,7 @@
             <w:pPr>
               <w:pStyle w:val="Normal"/>
               <w:widowControl/>
+              <w:suppressAutoHyphens w:val="true"/>
               <w:spacing w:lineRule="auto" w:line="240" w:before="0" w:after="0"/>
               <w:jc w:val="left"/>
               <w:rPr>
@@ -333,13 +334,14 @@
         </w:tc>
         <w:tc>
           <w:tcPr>
-            <w:tcW w:w="6733" w:type="dxa"/>
+            <w:tcW w:w="6734" w:type="dxa"/>
             <w:tcBorders/>
           </w:tcPr>
           <w:p>
             <w:pPr>
               <w:pStyle w:val="Normal"/>
               <w:widowControl/>
+              <w:suppressAutoHyphens w:val="true"/>
               <w:spacing w:lineRule="auto" w:line="240" w:before="0" w:after="0"/>
               <w:jc w:val="left"/>
               <w:rPr>
@@ -367,7 +369,7 @@
         <w:trPr/>
         <w:tc>
           <w:tcPr>
-            <w:tcW w:w="2282" w:type="dxa"/>
+            <w:tcW w:w="2281" w:type="dxa"/>
             <w:tcBorders/>
             <w:shd w:color="auto" w:fill="FFFFFF" w:themeFill="background1" w:val="clear"/>
           </w:tcPr>
@@ -375,6 +377,7 @@
             <w:pPr>
               <w:pStyle w:val="Normal"/>
               <w:widowControl/>
+              <w:suppressAutoHyphens w:val="true"/>
               <w:spacing w:lineRule="auto" w:line="240" w:before="0" w:after="0"/>
               <w:jc w:val="left"/>
               <w:rPr>
@@ -401,13 +404,14 @@
         </w:tc>
         <w:tc>
           <w:tcPr>
-            <w:tcW w:w="6733" w:type="dxa"/>
+            <w:tcW w:w="6734" w:type="dxa"/>
             <w:tcBorders/>
           </w:tcPr>
           <w:p>
             <w:pPr>
               <w:pStyle w:val="Normal"/>
               <w:widowControl/>
+              <w:suppressAutoHyphens w:val="true"/>
               <w:spacing w:lineRule="auto" w:line="240" w:before="0" w:after="0"/>
               <w:jc w:val="left"/>
               <w:rPr>
@@ -435,7 +439,7 @@
         <w:trPr/>
         <w:tc>
           <w:tcPr>
-            <w:tcW w:w="2282" w:type="dxa"/>
+            <w:tcW w:w="2281" w:type="dxa"/>
             <w:tcBorders/>
             <w:shd w:color="auto" w:fill="FFFFFF" w:themeFill="background1" w:val="clear"/>
           </w:tcPr>
@@ -443,6 +447,7 @@
             <w:pPr>
               <w:pStyle w:val="Normal"/>
               <w:widowControl/>
+              <w:suppressAutoHyphens w:val="true"/>
               <w:spacing w:lineRule="auto" w:line="240" w:before="0" w:after="0"/>
               <w:jc w:val="left"/>
               <w:rPr>
@@ -469,13 +474,14 @@
         </w:tc>
         <w:tc>
           <w:tcPr>
-            <w:tcW w:w="6733" w:type="dxa"/>
+            <w:tcW w:w="6734" w:type="dxa"/>
             <w:tcBorders/>
           </w:tcPr>
           <w:p>
             <w:pPr>
               <w:pStyle w:val="Normal"/>
               <w:widowControl/>
+              <w:suppressAutoHyphens w:val="true"/>
               <w:spacing w:lineRule="auto" w:line="240" w:before="0" w:after="0"/>
               <w:jc w:val="left"/>
               <w:rPr>
@@ -503,7 +509,7 @@
         <w:trPr/>
         <w:tc>
           <w:tcPr>
-            <w:tcW w:w="2282" w:type="dxa"/>
+            <w:tcW w:w="2281" w:type="dxa"/>
             <w:tcBorders/>
             <w:shd w:color="auto" w:fill="FFFFFF" w:themeFill="background1" w:val="clear"/>
           </w:tcPr>
@@ -511,6 +517,7 @@
             <w:pPr>
               <w:pStyle w:val="Normal"/>
               <w:widowControl/>
+              <w:suppressAutoHyphens w:val="true"/>
               <w:spacing w:lineRule="auto" w:line="240" w:before="0" w:after="0"/>
               <w:jc w:val="left"/>
               <w:rPr>
@@ -524,7 +531,7 @@
             <w:hyperlink r:id="rId3">
               <w:r>
                 <w:rPr>
-                  <w:rStyle w:val="ListLabel37"/>
+                  <w:rStyle w:val="ListLabel46"/>
                   <w:rFonts w:eastAsia="Times New Roman" w:cs="Calibri" w:ascii="Calibri" w:hAnsi="Calibri"/>
                   <w:b/>
                   <w:bCs/>
@@ -553,13 +560,14 @@
         </w:tc>
         <w:tc>
           <w:tcPr>
-            <w:tcW w:w="6733" w:type="dxa"/>
+            <w:tcW w:w="6734" w:type="dxa"/>
             <w:tcBorders/>
           </w:tcPr>
           <w:p>
             <w:pPr>
               <w:pStyle w:val="Normal"/>
               <w:widowControl/>
+              <w:suppressAutoHyphens w:val="true"/>
               <w:spacing w:lineRule="auto" w:line="240" w:before="0" w:after="0"/>
               <w:jc w:val="left"/>
               <w:rPr>
@@ -639,6 +647,7 @@
             <w:pPr>
               <w:pStyle w:val="Normal"/>
               <w:widowControl/>
+              <w:suppressAutoHyphens w:val="true"/>
               <w:spacing w:lineRule="auto" w:line="240" w:before="0" w:after="0"/>
               <w:jc w:val="left"/>
               <w:rPr>
@@ -672,6 +681,7 @@
             <w:pPr>
               <w:pStyle w:val="Normal"/>
               <w:widowControl/>
+              <w:suppressAutoHyphens w:val="true"/>
               <w:spacing w:lineRule="auto" w:line="240" w:before="0" w:after="0"/>
               <w:jc w:val="left"/>
               <w:rPr>
@@ -681,11 +691,8 @@
             <w:r>
               <w:rPr>
                 <w:rFonts w:eastAsia="Times New Roman" w:cs="Calibri" w:ascii="Calibri" w:hAnsi="Calibri"/>
-                <w:kern w:val="2"/>
-                <w:sz w:val="24"/>
-                <w:szCs w:val="24"/>
-                <w:lang w:val="en-GB" w:eastAsia="en-US" w:bidi="ar-SA"/>
               </w:rPr>
+              <w:t>3546619</w:t>
             </w:r>
           </w:p>
         </w:tc>
@@ -702,6 +709,7 @@
             <w:pPr>
               <w:pStyle w:val="Normal"/>
               <w:widowControl/>
+              <w:suppressAutoHyphens w:val="true"/>
               <w:spacing w:lineRule="auto" w:line="240" w:before="0" w:after="0"/>
               <w:jc w:val="left"/>
               <w:rPr>
@@ -733,6 +741,7 @@
             <w:pPr>
               <w:pStyle w:val="Normal"/>
               <w:widowControl/>
+              <w:suppressAutoHyphens w:val="true"/>
               <w:spacing w:lineRule="auto" w:line="240" w:before="0" w:after="0"/>
               <w:jc w:val="left"/>
               <w:rPr>
@@ -742,10 +751,6 @@
             <w:r>
               <w:rPr>
                 <w:rFonts w:eastAsia="Times New Roman" w:cs="Calibri" w:ascii="Calibri" w:hAnsi="Calibri"/>
-                <w:kern w:val="2"/>
-                <w:sz w:val="24"/>
-                <w:szCs w:val="24"/>
-                <w:lang w:val="en-GB" w:eastAsia="en-US" w:bidi="ar-SA"/>
               </w:rPr>
             </w:r>
           </w:p>
@@ -834,6 +839,7 @@
               <w:pStyle w:val="Normal"/>
               <w:widowControl/>
               <w:shd w:val="clear" w:color="auto" w:fill="FFFFFF"/>
+              <w:suppressAutoHyphens w:val="true"/>
               <w:spacing w:lineRule="auto" w:line="240" w:before="0" w:after="0"/>
               <w:jc w:val="left"/>
               <w:rPr>
@@ -847,10 +853,6 @@
                 <w:rFonts w:eastAsia="Times New Roman" w:cs="Calibri" w:ascii="Calibri" w:hAnsi="Calibri"/>
                 <w:b/>
                 <w:iCs/>
-                <w:kern w:val="2"/>
-                <w:sz w:val="24"/>
-                <w:szCs w:val="24"/>
-                <w:lang w:val="en-GB" w:eastAsia="en-US" w:bidi="ar-SA"/>
               </w:rPr>
             </w:r>
           </w:p>
@@ -859,6 +861,7 @@
               <w:pStyle w:val="Normal"/>
               <w:widowControl/>
               <w:shd w:val="clear" w:color="auto" w:fill="FFFFFF"/>
+              <w:suppressAutoHyphens w:val="true"/>
               <w:spacing w:lineRule="auto" w:line="240" w:before="0" w:after="0"/>
               <w:jc w:val="left"/>
               <w:rPr>
@@ -872,10 +875,6 @@
                 <w:rFonts w:eastAsia="Times New Roman" w:cs="Calibri" w:ascii="Calibri" w:hAnsi="Calibri"/>
                 <w:b/>
                 <w:iCs/>
-                <w:kern w:val="2"/>
-                <w:sz w:val="24"/>
-                <w:szCs w:val="24"/>
-                <w:lang w:val="en-GB" w:eastAsia="en-US" w:bidi="ar-SA"/>
               </w:rPr>
             </w:r>
           </w:p>
@@ -884,6 +883,7 @@
               <w:pStyle w:val="Normal"/>
               <w:widowControl/>
               <w:shd w:val="clear" w:color="auto" w:fill="FFFFFF"/>
+              <w:suppressAutoHyphens w:val="true"/>
               <w:spacing w:lineRule="auto" w:line="240" w:before="0" w:after="0"/>
               <w:jc w:val="left"/>
               <w:rPr>
@@ -897,10 +897,6 @@
                 <w:rFonts w:eastAsia="Times New Roman" w:cs="Calibri" w:ascii="Calibri" w:hAnsi="Calibri"/>
                 <w:b/>
                 <w:iCs/>
-                <w:kern w:val="2"/>
-                <w:sz w:val="24"/>
-                <w:szCs w:val="24"/>
-                <w:lang w:val="en-GB" w:eastAsia="en-US" w:bidi="ar-SA"/>
               </w:rPr>
             </w:r>
           </w:p>
@@ -909,6 +905,7 @@
               <w:pStyle w:val="Normal"/>
               <w:widowControl/>
               <w:shd w:val="clear" w:color="auto" w:fill="FFFFFF"/>
+              <w:suppressAutoHyphens w:val="true"/>
               <w:spacing w:lineRule="auto" w:line="240" w:before="0" w:after="0"/>
               <w:jc w:val="left"/>
               <w:rPr>
@@ -922,10 +919,6 @@
                 <w:rFonts w:eastAsia="Times New Roman" w:cs="Calibri" w:ascii="Calibri" w:hAnsi="Calibri"/>
                 <w:b/>
                 <w:iCs/>
-                <w:kern w:val="2"/>
-                <w:sz w:val="24"/>
-                <w:szCs w:val="24"/>
-                <w:lang w:val="en-GB" w:eastAsia="en-US" w:bidi="ar-SA"/>
               </w:rPr>
             </w:r>
           </w:p>
@@ -945,6 +938,7 @@
               <w:pStyle w:val="Normal"/>
               <w:widowControl/>
               <w:shd w:val="clear" w:color="auto" w:fill="FFFFFF"/>
+              <w:suppressAutoHyphens w:val="true"/>
               <w:spacing w:lineRule="auto" w:line="240" w:before="0" w:after="0"/>
               <w:jc w:val="left"/>
               <w:rPr>
@@ -954,10 +948,6 @@
             <w:r>
               <w:rPr>
                 <w:rFonts w:eastAsia="Times New Roman" w:cs="Calibri" w:ascii="Calibri" w:hAnsi="Calibri"/>
-                <w:kern w:val="2"/>
-                <w:sz w:val="24"/>
-                <w:szCs w:val="24"/>
-                <w:lang w:val="en-GB" w:eastAsia="en-US" w:bidi="ar-SA"/>
               </w:rPr>
             </w:r>
           </w:p>
@@ -1027,14 +1017,6 @@
             </w:rPr>
             <w:t>☒</w:t>
           </w:r>
-          <w:r>
-            <w:rPr>
-              <w:rFonts w:eastAsia="MS Mincho" w:cs="Segoe UI Symbol" w:ascii="Segoe UI Symbol" w:hAnsi="Segoe UI Symbol"/>
-              <w:kern w:val="0"/>
-              <w:lang w:val="en-US" w:eastAsia="ja-JP"/>
-              <w14:ligatures w14:val="none"/>
-            </w:rPr>
-          </w:r>
         </w:sdtContent>
       </w:sdt>
       <w:r>
@@ -1095,14 +1077,6 @@
             </w:rPr>
             <w:t>☒</w:t>
           </w:r>
-          <w:r>
-            <w:rPr>
-              <w:rFonts w:eastAsia="MS Mincho" w:cs="Segoe UI Symbol" w:ascii="Segoe UI Symbol" w:hAnsi="Segoe UI Symbol"/>
-              <w:kern w:val="0"/>
-              <w:lang w:val="en-US" w:eastAsia="ja-JP"/>
-              <w14:ligatures w14:val="none"/>
-            </w:rPr>
-          </w:r>
         </w:sdtContent>
       </w:sdt>
       <w:r>
@@ -1162,14 +1136,6 @@
             </w:rPr>
             <w:t>☒</w:t>
           </w:r>
-          <w:r>
-            <w:rPr>
-              <w:rFonts w:eastAsia="MS Mincho" w:cs="Segoe UI Symbol" w:ascii="Segoe UI Symbol" w:hAnsi="Segoe UI Symbol"/>
-              <w:kern w:val="0"/>
-              <w:lang w:val="en-US" w:eastAsia="ja-JP"/>
-              <w14:ligatures w14:val="none"/>
-            </w:rPr>
-          </w:r>
         </w:sdtContent>
       </w:sdt>
       <w:r>
@@ -1254,14 +1220,6 @@
             </w:rPr>
             <w:t>☒</w:t>
           </w:r>
-          <w:r>
-            <w:rPr>
-              <w:rFonts w:eastAsia="MS Mincho" w:cs="Segoe UI Symbol" w:ascii="Segoe UI Symbol" w:hAnsi="Segoe UI Symbol"/>
-              <w:kern w:val="0"/>
-              <w:lang w:val="en-US" w:eastAsia="ja-JP"/>
-              <w14:ligatures w14:val="none"/>
-            </w:rPr>
-          </w:r>
         </w:sdtContent>
       </w:sdt>
       <w:r>
@@ -1285,7 +1243,7 @@
       <w:hyperlink r:id="rId4">
         <w:r>
           <w:rPr>
-            <w:rStyle w:val="ListLabel38"/>
+            <w:rStyle w:val="ListLabel47"/>
             <w:rFonts w:eastAsia="MS Mincho" w:cs="Calibri" w:ascii="Calibri" w:hAnsi="Calibri"/>
             <w:color w:val="467886"/>
             <w:kern w:val="0"/>
@@ -1308,7 +1266,7 @@
       <w:hyperlink r:id="rId5">
         <w:r>
           <w:rPr>
-            <w:rStyle w:val="ListLabel38"/>
+            <w:rStyle w:val="ListLabel47"/>
             <w:rFonts w:eastAsia="MS Mincho" w:cs="Calibri" w:ascii="Calibri" w:hAnsi="Calibri"/>
             <w:color w:val="467886"/>
             <w:kern w:val="0"/>
@@ -1408,6 +1366,7 @@
             <w:pPr>
               <w:pStyle w:val="Normal"/>
               <w:widowControl/>
+              <w:suppressAutoHyphens w:val="true"/>
               <w:spacing w:lineRule="auto" w:line="240" w:before="0" w:after="0"/>
               <w:jc w:val="left"/>
               <w:rPr>
@@ -1437,6 +1396,7 @@
             <w:pPr>
               <w:pStyle w:val="Normal"/>
               <w:widowControl/>
+              <w:suppressAutoHyphens w:val="true"/>
               <w:spacing w:lineRule="auto" w:line="240" w:before="0" w:after="0"/>
               <w:jc w:val="center"/>
               <w:rPr>
@@ -1447,24 +1407,18 @@
             </w:pPr>
             <w:sdt>
               <w:sdtPr>
-                <w:alias w:val=""/>
-                <w:dropDownList w:lastValue="2">
-                  <w:listItem w:value="Choose an item." w:displayText="Choose an item."/>
-                  <w:listItem w:value="Yes" w:displayText="Yes"/>
-                  <w:listItem w:value="No" w:displayText="No"/>
+                <w:dropDownList>
+                  <w:listItem w:displayText="Choose an item." w:value="Choose an item."/>
+                  <w:listItem w:displayText="Yes" w:value="Yes"/>
+                  <w:listItem w:displayText="No" w:value="No"/>
                 </w:dropDownList>
               </w:sdtPr>
               <w:sdtContent>
                 <w:r>
-                  <w:rPr>
-                    <w:rFonts w:eastAsia="Aptos" w:cs="Times New Roman"/>
-                    <w:kern w:val="2"/>
-                    <w:sz w:val="24"/>
-                    <w:szCs w:val="24"/>
-                    <w:lang w:val="en-GB" w:eastAsia="en-US" w:bidi="ar-SA"/>
-                  </w:rPr>
+                  <w:rPr/>
                 </w:r>
                 <w:r>
+                  <w:rPr/>
                   <w:t>No</w:t>
                 </w:r>
               </w:sdtContent>
@@ -1551,6 +1505,7 @@
             <w:pPr>
               <w:pStyle w:val="Normal"/>
               <w:widowControl/>
+              <w:suppressAutoHyphens w:val="true"/>
               <w:spacing w:lineRule="auto" w:line="240" w:before="0" w:after="0"/>
               <w:jc w:val="left"/>
               <w:rPr>
@@ -1568,7 +1523,7 @@
                 <w:kern w:val="0"/>
                 <w:sz w:val="24"/>
                 <w:szCs w:val="24"/>
-                <w:lang w:val="en-US" w:eastAsia="ja-JP" w:bidi="ar-SA"/>
+                <w:lang w:val="en-US" w:eastAsia="ja-JP"/>
                 <w14:ligatures w14:val="none"/>
               </w:rPr>
             </w:r>
@@ -1577,6 +1532,7 @@
             <w:pPr>
               <w:pStyle w:val="Normal"/>
               <w:widowControl/>
+              <w:suppressAutoHyphens w:val="true"/>
               <w:spacing w:lineRule="auto" w:line="240" w:before="0" w:after="0"/>
               <w:jc w:val="left"/>
               <w:rPr>
@@ -1594,7 +1550,7 @@
                 <w:kern w:val="0"/>
                 <w:sz w:val="24"/>
                 <w:szCs w:val="24"/>
-                <w:lang w:val="en-US" w:eastAsia="ja-JP" w:bidi="ar-SA"/>
+                <w:lang w:val="en-US" w:eastAsia="ja-JP"/>
                 <w14:ligatures w14:val="none"/>
               </w:rPr>
             </w:r>
@@ -1603,6 +1559,7 @@
             <w:pPr>
               <w:pStyle w:val="Normal"/>
               <w:widowControl/>
+              <w:suppressAutoHyphens w:val="true"/>
               <w:spacing w:lineRule="auto" w:line="240" w:before="0" w:after="0"/>
               <w:jc w:val="left"/>
               <w:rPr>
@@ -1616,9 +1573,7 @@
               <w:rPr>
                 <w:rFonts w:eastAsia="Times New Roman" w:cs="Calibri" w:ascii="Calibri" w:hAnsi="Calibri"/>
                 <w:kern w:val="0"/>
-                <w:sz w:val="22"/>
-                <w:szCs w:val="22"/>
-                <w:lang w:val="en-US" w:eastAsia="ja-JP" w:bidi="ar-SA"/>
+                <w:lang w:val="en-US" w:eastAsia="ja-JP"/>
                 <w14:ligatures w14:val="none"/>
               </w:rPr>
             </w:r>
@@ -1753,6 +1708,7 @@
             <w:pPr>
               <w:pStyle w:val="Normal"/>
               <w:widowControl/>
+              <w:suppressAutoHyphens w:val="true"/>
               <w:spacing w:lineRule="auto" w:line="240" w:before="0" w:after="0"/>
               <w:jc w:val="left"/>
               <w:rPr>
@@ -1782,6 +1738,7 @@
             <w:pPr>
               <w:pStyle w:val="Normal"/>
               <w:widowControl/>
+              <w:suppressAutoHyphens w:val="true"/>
               <w:spacing w:lineRule="auto" w:line="240" w:before="0" w:after="0"/>
               <w:jc w:val="center"/>
               <w:rPr>
@@ -1792,24 +1749,18 @@
             </w:pPr>
             <w:sdt>
               <w:sdtPr>
-                <w:alias w:val=""/>
-                <w:dropDownList w:lastValue="2">
-                  <w:listItem w:value="Choose an item." w:displayText="Choose an item."/>
-                  <w:listItem w:value="Yes" w:displayText="Yes"/>
-                  <w:listItem w:value="No" w:displayText="No"/>
+                <w:dropDownList>
+                  <w:listItem w:displayText="Choose an item." w:value="Choose an item."/>
+                  <w:listItem w:displayText="Yes" w:value="Yes"/>
+                  <w:listItem w:displayText="No" w:value="No"/>
                 </w:dropDownList>
               </w:sdtPr>
               <w:sdtContent>
                 <w:r>
-                  <w:rPr>
-                    <w:rFonts w:eastAsia="Aptos" w:cs="Times New Roman"/>
-                    <w:kern w:val="2"/>
-                    <w:sz w:val="24"/>
-                    <w:szCs w:val="24"/>
-                    <w:lang w:val="en-GB" w:eastAsia="en-US" w:bidi="ar-SA"/>
-                  </w:rPr>
+                  <w:rPr/>
                 </w:r>
                 <w:r>
+                  <w:rPr/>
                   <w:t>No</w:t>
                 </w:r>
               </w:sdtContent>
@@ -1828,6 +1779,7 @@
             <w:pPr>
               <w:pStyle w:val="Normal"/>
               <w:widowControl/>
+              <w:suppressAutoHyphens w:val="true"/>
               <w:spacing w:lineRule="auto" w:line="240" w:before="0" w:after="0"/>
               <w:jc w:val="left"/>
               <w:rPr>
@@ -1857,6 +1809,7 @@
             <w:pPr>
               <w:pStyle w:val="Normal"/>
               <w:widowControl/>
+              <w:suppressAutoHyphens w:val="true"/>
               <w:spacing w:lineRule="auto" w:line="240" w:before="0" w:after="0"/>
               <w:jc w:val="center"/>
               <w:rPr>
@@ -1867,24 +1820,18 @@
             </w:pPr>
             <w:sdt>
               <w:sdtPr>
-                <w:alias w:val=""/>
-                <w:dropDownList w:lastValue="2">
-                  <w:listItem w:value="Choose an item." w:displayText="Choose an item."/>
-                  <w:listItem w:value="Yes" w:displayText="Yes"/>
-                  <w:listItem w:value="No" w:displayText="No"/>
+                <w:dropDownList>
+                  <w:listItem w:displayText="Choose an item." w:value="Choose an item."/>
+                  <w:listItem w:displayText="Yes" w:value="Yes"/>
+                  <w:listItem w:displayText="No" w:value="No"/>
                 </w:dropDownList>
               </w:sdtPr>
               <w:sdtContent>
                 <w:r>
-                  <w:rPr>
-                    <w:rFonts w:eastAsia="Aptos" w:cs="Times New Roman"/>
-                    <w:kern w:val="2"/>
-                    <w:sz w:val="24"/>
-                    <w:szCs w:val="24"/>
-                    <w:lang w:val="en-GB" w:eastAsia="en-US" w:bidi="ar-SA"/>
-                  </w:rPr>
+                  <w:rPr/>
                 </w:r>
                 <w:r>
+                  <w:rPr/>
                   <w:t>No</w:t>
                 </w:r>
               </w:sdtContent>
@@ -1903,6 +1850,7 @@
             <w:pPr>
               <w:pStyle w:val="Normal"/>
               <w:widowControl/>
+              <w:suppressAutoHyphens w:val="true"/>
               <w:spacing w:lineRule="auto" w:line="240" w:before="0" w:after="0"/>
               <w:jc w:val="left"/>
               <w:rPr>
@@ -1932,6 +1880,7 @@
             <w:pPr>
               <w:pStyle w:val="Normal"/>
               <w:widowControl/>
+              <w:suppressAutoHyphens w:val="true"/>
               <w:spacing w:lineRule="auto" w:line="240" w:before="0" w:after="0"/>
               <w:jc w:val="center"/>
               <w:rPr>
@@ -1942,24 +1891,18 @@
             </w:pPr>
             <w:sdt>
               <w:sdtPr>
-                <w:alias w:val=""/>
-                <w:dropDownList w:lastValue="2">
-                  <w:listItem w:value="Choose an item." w:displayText="Choose an item."/>
-                  <w:listItem w:value="Yes" w:displayText="Yes"/>
-                  <w:listItem w:value="No" w:displayText="No"/>
+                <w:dropDownList>
+                  <w:listItem w:displayText="Choose an item." w:value="Choose an item."/>
+                  <w:listItem w:displayText="Yes" w:value="Yes"/>
+                  <w:listItem w:displayText="No" w:value="No"/>
                 </w:dropDownList>
               </w:sdtPr>
               <w:sdtContent>
                 <w:r>
-                  <w:rPr>
-                    <w:rFonts w:eastAsia="Aptos" w:cs="Times New Roman"/>
-                    <w:kern w:val="2"/>
-                    <w:sz w:val="24"/>
-                    <w:szCs w:val="24"/>
-                    <w:lang w:val="en-GB" w:eastAsia="en-US" w:bidi="ar-SA"/>
-                  </w:rPr>
+                  <w:rPr/>
                 </w:r>
                 <w:r>
+                  <w:rPr/>
                   <w:t>No</w:t>
                 </w:r>
               </w:sdtContent>
@@ -1978,6 +1921,7 @@
             <w:pPr>
               <w:pStyle w:val="Normal"/>
               <w:widowControl/>
+              <w:suppressAutoHyphens w:val="true"/>
               <w:spacing w:lineRule="auto" w:line="240" w:before="0" w:after="0"/>
               <w:jc w:val="left"/>
               <w:rPr>
@@ -2007,6 +1951,7 @@
             <w:pPr>
               <w:pStyle w:val="Normal"/>
               <w:widowControl/>
+              <w:suppressAutoHyphens w:val="true"/>
               <w:spacing w:lineRule="auto" w:line="240" w:before="0" w:after="0"/>
               <w:jc w:val="center"/>
               <w:rPr>
@@ -2017,24 +1962,18 @@
             </w:pPr>
             <w:sdt>
               <w:sdtPr>
-                <w:alias w:val=""/>
-                <w:dropDownList w:lastValue="2">
-                  <w:listItem w:value="Choose an item." w:displayText="Choose an item."/>
-                  <w:listItem w:value="Yes" w:displayText="Yes"/>
-                  <w:listItem w:value="No" w:displayText="No"/>
+                <w:dropDownList>
+                  <w:listItem w:displayText="Choose an item." w:value="Choose an item."/>
+                  <w:listItem w:displayText="Yes" w:value="Yes"/>
+                  <w:listItem w:displayText="No" w:value="No"/>
                 </w:dropDownList>
               </w:sdtPr>
               <w:sdtContent>
                 <w:r>
-                  <w:rPr>
-                    <w:rFonts w:eastAsia="Aptos" w:cs="Times New Roman"/>
-                    <w:kern w:val="2"/>
-                    <w:sz w:val="24"/>
-                    <w:szCs w:val="24"/>
-                    <w:lang w:val="en-GB" w:eastAsia="en-US" w:bidi="ar-SA"/>
-                  </w:rPr>
+                  <w:rPr/>
                 </w:r>
                 <w:r>
+                  <w:rPr/>
                   <w:t>No</w:t>
                 </w:r>
               </w:sdtContent>
@@ -2053,6 +1992,7 @@
             <w:pPr>
               <w:pStyle w:val="Normal"/>
               <w:widowControl/>
+              <w:suppressAutoHyphens w:val="true"/>
               <w:spacing w:lineRule="auto" w:line="240" w:before="0" w:after="0"/>
               <w:jc w:val="left"/>
               <w:rPr>
@@ -2082,6 +2022,7 @@
             <w:pPr>
               <w:pStyle w:val="Normal"/>
               <w:widowControl/>
+              <w:suppressAutoHyphens w:val="true"/>
               <w:spacing w:lineRule="auto" w:line="240" w:before="0" w:after="0"/>
               <w:jc w:val="center"/>
               <w:rPr>
@@ -2092,24 +2033,18 @@
             </w:pPr>
             <w:sdt>
               <w:sdtPr>
-                <w:alias w:val=""/>
-                <w:dropDownList w:lastValue="2">
-                  <w:listItem w:value="Choose an item." w:displayText="Choose an item."/>
-                  <w:listItem w:value="Yes" w:displayText="Yes"/>
-                  <w:listItem w:value="No" w:displayText="No"/>
+                <w:dropDownList>
+                  <w:listItem w:displayText="Choose an item." w:value="Choose an item."/>
+                  <w:listItem w:displayText="Yes" w:value="Yes"/>
+                  <w:listItem w:displayText="No" w:value="No"/>
                 </w:dropDownList>
               </w:sdtPr>
               <w:sdtContent>
                 <w:r>
-                  <w:rPr>
-                    <w:rFonts w:eastAsia="Aptos" w:cs="Times New Roman"/>
-                    <w:kern w:val="2"/>
-                    <w:sz w:val="24"/>
-                    <w:szCs w:val="24"/>
-                    <w:lang w:val="en-GB" w:eastAsia="en-US" w:bidi="ar-SA"/>
-                  </w:rPr>
+                  <w:rPr/>
                 </w:r>
                 <w:r>
+                  <w:rPr/>
                   <w:t>No</w:t>
                 </w:r>
               </w:sdtContent>
@@ -2128,6 +2063,7 @@
             <w:pPr>
               <w:pStyle w:val="Normal"/>
               <w:widowControl/>
+              <w:suppressAutoHyphens w:val="true"/>
               <w:spacing w:lineRule="auto" w:line="240" w:before="0" w:after="0"/>
               <w:jc w:val="left"/>
               <w:rPr>
@@ -2144,7 +2080,7 @@
                 <w:szCs w:val="22"/>
                 <w:lang w:val="en-GB" w:eastAsia="en-US" w:bidi="ar-SA"/>
               </w:rPr>
-              <w:t xml:space="preserve">Drafting or writing parts of my assignment </w:t>
+              <w:t>Drafting or writing parts of my assignment</w:t>
             </w:r>
           </w:p>
         </w:tc>
@@ -2157,6 +2093,7 @@
             <w:pPr>
               <w:pStyle w:val="Normal"/>
               <w:widowControl/>
+              <w:suppressAutoHyphens w:val="true"/>
               <w:spacing w:lineRule="auto" w:line="240" w:before="0" w:after="0"/>
               <w:jc w:val="center"/>
               <w:rPr>
@@ -2167,24 +2104,18 @@
             </w:pPr>
             <w:sdt>
               <w:sdtPr>
-                <w:alias w:val=""/>
-                <w:dropDownList w:lastValue="2">
-                  <w:listItem w:value="Choose an item." w:displayText="Choose an item."/>
-                  <w:listItem w:value="Yes" w:displayText="Yes"/>
-                  <w:listItem w:value="No" w:displayText="No"/>
+                <w:dropDownList>
+                  <w:listItem w:displayText="Choose an item." w:value="Choose an item."/>
+                  <w:listItem w:displayText="Yes" w:value="Yes"/>
+                  <w:listItem w:displayText="No" w:value="No"/>
                 </w:dropDownList>
               </w:sdtPr>
               <w:sdtContent>
                 <w:r>
-                  <w:rPr>
-                    <w:rFonts w:eastAsia="Aptos" w:cs="Times New Roman"/>
-                    <w:kern w:val="2"/>
-                    <w:sz w:val="24"/>
-                    <w:szCs w:val="24"/>
-                    <w:lang w:val="en-GB" w:eastAsia="en-US" w:bidi="ar-SA"/>
-                  </w:rPr>
+                  <w:rPr/>
                 </w:r>
                 <w:r>
+                  <w:rPr/>
                   <w:t>No</w:t>
                 </w:r>
               </w:sdtContent>
@@ -2204,6 +2135,7 @@
             <w:pPr>
               <w:pStyle w:val="Normal"/>
               <w:widowControl/>
+              <w:suppressAutoHyphens w:val="true"/>
               <w:spacing w:lineRule="auto" w:line="240" w:before="0" w:after="0"/>
               <w:jc w:val="left"/>
               <w:rPr>
@@ -2379,6 +2311,7 @@
             <w:pPr>
               <w:pStyle w:val="Normal"/>
               <w:widowControl/>
+              <w:suppressAutoHyphens w:val="true"/>
               <w:spacing w:lineRule="auto" w:line="240" w:before="0" w:after="0"/>
               <w:jc w:val="left"/>
               <w:rPr>
@@ -2397,7 +2330,7 @@
                 <w:lang w:val="en-US" w:eastAsia="ja-JP" w:bidi="ar-SA"/>
                 <w14:ligatures w14:val="none"/>
               </w:rPr>
-              <w:t xml:space="preserve">Proof of Process Link: </w:t>
+              <w:t>Proof of Process Link: https://github.com/lappland-stack/Datascience-Assignment-UoS/tree/main</w:t>
             </w:r>
           </w:p>
         </w:tc>
@@ -2525,7 +2458,8 @@
           <w:ilvl w:val="0"/>
           <w:numId w:val="0"/>
         </w:numPr>
-        <w:spacing w:lineRule="auto" w:line="278" w:before="0" w:after="80"/>
+        <w:spacing w:lineRule="auto" w:line="276" w:before="0" w:after="80"/>
+        <w:ind w:hanging="0" w:left="0"/>
         <w:outlineLvl w:val="1"/>
         <w:rPr>
           <w:rFonts w:ascii="Calibri" w:hAnsi="Calibri" w:eastAsia="MS Gothic" w:cs="Calibri"/>
@@ -2563,7 +2497,8 @@
           <w:ilvl w:val="0"/>
           <w:numId w:val="0"/>
         </w:numPr>
-        <w:spacing w:lineRule="auto" w:line="278" w:before="160" w:after="80"/>
+        <w:spacing w:lineRule="auto" w:line="276" w:before="160" w:after="80"/>
+        <w:ind w:hanging="0" w:left="0"/>
         <w:outlineLvl w:val="1"/>
         <w:rPr>
           <w:rFonts w:ascii="Calibri" w:hAnsi="Calibri" w:eastAsia="system-ui" w:cs="Calibri"/>
@@ -2595,7 +2530,8 @@
           <w:ilvl w:val="0"/>
           <w:numId w:val="0"/>
         </w:numPr>
-        <w:spacing w:lineRule="auto" w:line="278" w:before="240" w:after="120"/>
+        <w:spacing w:lineRule="auto" w:line="276" w:before="240" w:after="120"/>
+        <w:ind w:hanging="0" w:left="0"/>
         <w:outlineLvl w:val="1"/>
         <w:rPr>
           <w:rFonts w:ascii="Calibri" w:hAnsi="Calibri" w:eastAsia="MS Gothic" w:cs="Calibri"/>
@@ -2619,7 +2555,7 @@
     <w:p>
       <w:pPr>
         <w:pStyle w:val="Normal"/>
-        <w:spacing w:lineRule="auto" w:line="278"/>
+        <w:spacing w:lineRule="auto" w:line="276"/>
         <w:rPr>
           <w:rFonts w:ascii="Calibri" w:hAnsi="Calibri" w:eastAsia="MS Mincho" w:cs="Calibri"/>
           <w:kern w:val="0"/>
@@ -2646,7 +2582,8 @@
           <w:ilvl w:val="0"/>
           <w:numId w:val="0"/>
         </w:numPr>
-        <w:spacing w:lineRule="auto" w:line="278" w:before="240" w:after="120"/>
+        <w:spacing w:lineRule="auto" w:line="276" w:before="240" w:after="120"/>
+        <w:ind w:hanging="0" w:left="0"/>
         <w:outlineLvl w:val="1"/>
         <w:rPr>
           <w:rFonts w:ascii="Calibri" w:hAnsi="Calibri" w:eastAsia="MS Gothic" w:cs="Calibri"/>
@@ -2670,7 +2607,7 @@
     <w:p>
       <w:pPr>
         <w:pStyle w:val="Normal"/>
-        <w:spacing w:lineRule="auto" w:line="278"/>
+        <w:spacing w:lineRule="auto" w:line="276"/>
         <w:rPr>
           <w:rFonts w:ascii="Calibri" w:hAnsi="Calibri" w:eastAsia="MS Mincho" w:cs="Calibri"/>
           <w:kern w:val="0"/>
@@ -2697,7 +2634,8 @@
           <w:ilvl w:val="0"/>
           <w:numId w:val="0"/>
         </w:numPr>
-        <w:spacing w:lineRule="auto" w:line="278" w:before="240" w:after="120"/>
+        <w:spacing w:lineRule="auto" w:line="276" w:before="240" w:after="120"/>
+        <w:ind w:hanging="0" w:left="0"/>
         <w:outlineLvl w:val="1"/>
         <w:rPr>
           <w:rFonts w:ascii="Calibri" w:hAnsi="Calibri" w:eastAsia="MS Gothic" w:cs="Calibri"/>
@@ -2743,7 +2681,7 @@
     <w:p>
       <w:pPr>
         <w:pStyle w:val="Normal"/>
-        <w:spacing w:lineRule="auto" w:line="278" w:before="120" w:after="120"/>
+        <w:spacing w:lineRule="auto" w:line="276" w:before="120" w:after="120"/>
         <w:rPr>
           <w:rFonts w:ascii="Calibri" w:hAnsi="Calibri" w:eastAsia="MS Mincho" w:cs="Calibri"/>
           <w:kern w:val="0"/>
@@ -2770,7 +2708,8 @@
           <w:ilvl w:val="0"/>
           <w:numId w:val="0"/>
         </w:numPr>
-        <w:spacing w:lineRule="auto" w:line="278" w:before="240" w:after="120"/>
+        <w:spacing w:lineRule="auto" w:line="276" w:before="240" w:after="120"/>
+        <w:ind w:hanging="0" w:left="0"/>
         <w:outlineLvl w:val="1"/>
         <w:rPr>
           <w:rFonts w:ascii="Calibri" w:hAnsi="Calibri" w:eastAsia="MS Gothic" w:cs="Calibri"/>
@@ -2794,7 +2733,7 @@
     <w:p>
       <w:pPr>
         <w:pStyle w:val="Normal"/>
-        <w:spacing w:lineRule="auto" w:line="278"/>
+        <w:spacing w:lineRule="auto" w:line="276"/>
         <w:rPr>
           <w:rFonts w:ascii="Calibri" w:hAnsi="Calibri" w:eastAsia="MS Mincho" w:cs="Calibri"/>
           <w:kern w:val="0"/>
@@ -2814,7 +2753,7 @@
       <w:hyperlink r:id="rId6">
         <w:r>
           <w:rPr>
-            <w:rStyle w:val="ListLabel39"/>
+            <w:rStyle w:val="ListLabel48"/>
             <w:rFonts w:eastAsia="MS Mincho" w:cs="Calibri" w:ascii="Calibri" w:hAnsi="Calibri"/>
             <w:color w:val="467886"/>
             <w:kern w:val="0"/>
@@ -2838,7 +2777,7 @@
     <w:p>
       <w:pPr>
         <w:pStyle w:val="Normal"/>
-        <w:spacing w:lineRule="auto" w:line="278"/>
+        <w:spacing w:lineRule="auto" w:line="276"/>
         <w:rPr>
           <w:rFonts w:ascii="Calibri" w:hAnsi="Calibri" w:eastAsia="MS Mincho" w:cs="Calibri"/>
           <w:kern w:val="0"/>
@@ -2858,7 +2797,7 @@
       <w:hyperlink r:id="rId7">
         <w:r>
           <w:rPr>
-            <w:rStyle w:val="ListLabel39"/>
+            <w:rStyle w:val="ListLabel48"/>
             <w:rFonts w:eastAsia="MS Mincho" w:cs="Calibri" w:ascii="Calibri" w:hAnsi="Calibri"/>
             <w:color w:val="467886"/>
             <w:kern w:val="0"/>
@@ -2888,7 +2827,8 @@
           <w:ilvl w:val="0"/>
           <w:numId w:val="0"/>
         </w:numPr>
-        <w:spacing w:lineRule="auto" w:line="278" w:before="240" w:after="120"/>
+        <w:spacing w:lineRule="auto" w:line="276" w:before="240" w:after="120"/>
+        <w:ind w:hanging="0" w:left="0"/>
         <w:outlineLvl w:val="1"/>
         <w:rPr>
           <w:rFonts w:ascii="Calibri" w:hAnsi="Calibri" w:eastAsia="MS Gothic" w:cs="Calibri"/>
@@ -2912,7 +2852,7 @@
     <w:p>
       <w:pPr>
         <w:pStyle w:val="Normal"/>
-        <w:spacing w:lineRule="auto" w:line="278" w:before="120" w:after="120"/>
+        <w:spacing w:lineRule="auto" w:line="276" w:before="120" w:after="120"/>
         <w:rPr>
           <w:rFonts w:ascii="Calibri" w:hAnsi="Calibri" w:eastAsia="MS Mincho" w:cs="Calibri"/>
           <w:kern w:val="0"/>
@@ -2939,7 +2879,8 @@
           <w:ilvl w:val="0"/>
           <w:numId w:val="0"/>
         </w:numPr>
-        <w:spacing w:lineRule="auto" w:line="278" w:before="240" w:after="120"/>
+        <w:spacing w:lineRule="auto" w:line="276" w:before="240" w:after="120"/>
+        <w:ind w:hanging="0" w:left="0"/>
         <w:outlineLvl w:val="1"/>
         <w:rPr>
           <w:rFonts w:ascii="Calibri" w:hAnsi="Calibri" w:eastAsia="MS Gothic" w:cs="Calibri"/>
@@ -2963,7 +2904,7 @@
     <w:p>
       <w:pPr>
         <w:pStyle w:val="Normal"/>
-        <w:spacing w:lineRule="auto" w:line="278" w:before="120" w:after="120"/>
+        <w:spacing w:lineRule="auto" w:line="276" w:before="120" w:after="120"/>
         <w:rPr>
           <w:rFonts w:ascii="Calibri" w:hAnsi="Calibri" w:eastAsia="MS Mincho" w:cs="Calibri"/>
           <w:kern w:val="0"/>
@@ -2990,7 +2931,8 @@
           <w:ilvl w:val="0"/>
           <w:numId w:val="0"/>
         </w:numPr>
-        <w:spacing w:lineRule="auto" w:line="278" w:before="240" w:after="120"/>
+        <w:spacing w:lineRule="auto" w:line="276" w:before="240" w:after="120"/>
+        <w:ind w:hanging="0" w:left="0"/>
         <w:outlineLvl w:val="1"/>
         <w:rPr>
           <w:rFonts w:ascii="Calibri" w:hAnsi="Calibri" w:eastAsia="MS Gothic" w:cs="Calibri"/>
@@ -3014,7 +2956,7 @@
     <w:p>
       <w:pPr>
         <w:pStyle w:val="Normal"/>
-        <w:spacing w:lineRule="auto" w:line="278" w:before="120" w:after="120"/>
+        <w:spacing w:lineRule="auto" w:line="276" w:before="120" w:after="120"/>
         <w:rPr>
           <w:rFonts w:ascii="Calibri" w:hAnsi="Calibri" w:eastAsia="MS Mincho" w:cs="Calibri"/>
           <w:kern w:val="0"/>
@@ -3059,7 +3001,8 @@
           <w:ilvl w:val="0"/>
           <w:numId w:val="0"/>
         </w:numPr>
-        <w:spacing w:lineRule="auto" w:line="278" w:before="240" w:after="120"/>
+        <w:spacing w:lineRule="auto" w:line="276" w:before="240" w:after="120"/>
+        <w:ind w:hanging="0" w:left="0"/>
         <w:outlineLvl w:val="1"/>
         <w:rPr>
           <w:rFonts w:ascii="Calibri" w:hAnsi="Calibri" w:eastAsia="MS Gothic" w:cs="Calibri"/>
@@ -3083,7 +3026,7 @@
     <w:p>
       <w:pPr>
         <w:pStyle w:val="Normal"/>
-        <w:spacing w:lineRule="auto" w:line="278" w:before="120" w:after="120"/>
+        <w:spacing w:lineRule="auto" w:line="276" w:before="120" w:after="120"/>
         <w:rPr>
           <w:rFonts w:ascii="Calibri" w:hAnsi="Calibri" w:eastAsia="system-ui" w:cs="Calibri"/>
           <w:kern w:val="0"/>
@@ -3110,7 +3053,8 @@
           <w:ilvl w:val="0"/>
           <w:numId w:val="0"/>
         </w:numPr>
-        <w:spacing w:lineRule="auto" w:line="278" w:before="240" w:after="120"/>
+        <w:spacing w:lineRule="auto" w:line="276" w:before="240" w:after="120"/>
+        <w:ind w:hanging="0" w:left="0"/>
         <w:outlineLvl w:val="1"/>
         <w:rPr>
           <w:rFonts w:ascii="Calibri" w:hAnsi="Calibri" w:eastAsia="MS Gothic" w:cs="Calibri"/>
@@ -3134,7 +3078,7 @@
     <w:p>
       <w:pPr>
         <w:pStyle w:val="Normal"/>
-        <w:spacing w:lineRule="auto" w:line="278" w:before="120" w:after="120"/>
+        <w:spacing w:lineRule="auto" w:line="276" w:before="120" w:after="120"/>
         <w:rPr>
           <w:rFonts w:ascii="Calibri" w:hAnsi="Calibri" w:eastAsia="system-ui" w:cs="Calibri"/>
           <w:kern w:val="0"/>
@@ -3161,7 +3105,8 @@
           <w:ilvl w:val="0"/>
           <w:numId w:val="0"/>
         </w:numPr>
-        <w:spacing w:lineRule="auto" w:line="278" w:before="240" w:after="120"/>
+        <w:spacing w:lineRule="auto" w:line="276" w:before="240" w:after="120"/>
+        <w:ind w:hanging="0" w:left="0"/>
         <w:outlineLvl w:val="1"/>
         <w:rPr>
           <w:rFonts w:ascii="Calibri" w:hAnsi="Calibri" w:eastAsia="MS Gothic" w:cs="Calibri"/>
@@ -3185,7 +3130,7 @@
     <w:p>
       <w:pPr>
         <w:pStyle w:val="Normal"/>
-        <w:spacing w:lineRule="auto" w:line="278" w:before="120" w:after="120"/>
+        <w:spacing w:lineRule="auto" w:line="276" w:before="120" w:after="120"/>
         <w:rPr>
           <w:rFonts w:ascii="Calibri" w:hAnsi="Calibri" w:eastAsia="MS Mincho" w:cs="Calibri"/>
           <w:kern w:val="0"/>
@@ -3212,7 +3157,8 @@
           <w:ilvl w:val="0"/>
           <w:numId w:val="0"/>
         </w:numPr>
-        <w:spacing w:lineRule="auto" w:line="278" w:before="240" w:after="120"/>
+        <w:spacing w:lineRule="auto" w:line="276" w:before="240" w:after="120"/>
+        <w:ind w:hanging="0" w:left="0"/>
         <w:outlineLvl w:val="1"/>
         <w:rPr>
           <w:rFonts w:ascii="Calibri" w:hAnsi="Calibri" w:eastAsia="MS Gothic" w:cs="Calibri"/>
@@ -3236,7 +3182,7 @@
     <w:p>
       <w:pPr>
         <w:pStyle w:val="Normal"/>
-        <w:spacing w:lineRule="auto" w:line="278" w:before="120" w:after="120"/>
+        <w:spacing w:lineRule="auto" w:line="276" w:before="120" w:after="120"/>
         <w:rPr>
           <w:rFonts w:ascii="Calibri" w:hAnsi="Calibri" w:eastAsia="system-ui" w:cs="Calibri"/>
           <w:kern w:val="0"/>
@@ -3299,7 +3245,8 @@
           <w:ilvl w:val="0"/>
           <w:numId w:val="0"/>
         </w:numPr>
-        <w:spacing w:lineRule="auto" w:line="278" w:before="240" w:after="120"/>
+        <w:spacing w:lineRule="auto" w:line="276" w:before="240" w:after="120"/>
+        <w:ind w:hanging="0" w:left="0"/>
         <w:outlineLvl w:val="1"/>
         <w:rPr>
           <w:rFonts w:ascii="Calibri" w:hAnsi="Calibri" w:eastAsia="MS Gothic" w:cs="Calibri"/>
@@ -3323,7 +3270,7 @@
     <w:p>
       <w:pPr>
         <w:pStyle w:val="Normal"/>
-        <w:spacing w:lineRule="auto" w:line="278" w:before="120" w:after="120"/>
+        <w:spacing w:lineRule="auto" w:line="276" w:before="120" w:after="120"/>
         <w:rPr>
           <w:rFonts w:ascii="Calibri" w:hAnsi="Calibri" w:eastAsia="system-ui" w:cs="Calibri"/>
           <w:kern w:val="0"/>
@@ -3350,7 +3297,8 @@
           <w:ilvl w:val="0"/>
           <w:numId w:val="0"/>
         </w:numPr>
-        <w:spacing w:lineRule="auto" w:line="278" w:before="240" w:after="120"/>
+        <w:spacing w:lineRule="auto" w:line="276" w:before="240" w:after="120"/>
+        <w:ind w:hanging="0" w:left="0"/>
         <w:outlineLvl w:val="1"/>
         <w:rPr>
           <w:rFonts w:ascii="Calibri" w:hAnsi="Calibri" w:eastAsia="MS Gothic" w:cs="Calibri"/>
@@ -3374,7 +3322,7 @@
     <w:p>
       <w:pPr>
         <w:pStyle w:val="Normal"/>
-        <w:spacing w:lineRule="auto" w:line="278" w:before="120" w:after="120"/>
+        <w:spacing w:lineRule="auto" w:line="276" w:before="120" w:after="120"/>
         <w:rPr>
           <w:rFonts w:ascii="Calibri" w:hAnsi="Calibri" w:eastAsia="MS Mincho" w:cs="Calibri"/>
           <w:kern w:val="0"/>
@@ -3419,7 +3367,8 @@
           <w:ilvl w:val="0"/>
           <w:numId w:val="0"/>
         </w:numPr>
-        <w:spacing w:lineRule="auto" w:line="278" w:before="240" w:after="120"/>
+        <w:spacing w:lineRule="auto" w:line="276" w:before="240" w:after="120"/>
+        <w:ind w:hanging="0" w:left="0"/>
         <w:outlineLvl w:val="1"/>
         <w:rPr>
           <w:rFonts w:ascii="Calibri" w:hAnsi="Calibri" w:eastAsia="MS Gothic" w:cs="Calibri"/>
@@ -3443,7 +3392,7 @@
     <w:p>
       <w:pPr>
         <w:pStyle w:val="Normal"/>
-        <w:spacing w:lineRule="auto" w:line="278" w:before="120" w:after="120"/>
+        <w:spacing w:lineRule="auto" w:line="276" w:before="120" w:after="120"/>
         <w:rPr>
           <w:rFonts w:ascii="Calibri" w:hAnsi="Calibri" w:eastAsia="system-ui" w:cs="Calibri"/>
           <w:kern w:val="0"/>
@@ -6354,6 +6303,7 @@
     <w:rsid w:val="00641b24"/>
     <w:pPr>
       <w:widowControl/>
+      <w:suppressAutoHyphens w:val="true"/>
       <w:bidi w:val="0"/>
       <w:spacing w:lineRule="auto" w:line="259" w:before="0" w:after="160"/>
       <w:jc w:val="left"/>

</xml_diff>